<commit_message>
Remove references to instructor-only solutions
Reference solutions and the Lecturer Manual now live in a separate
private repo. Update the course README, Module 15 README, two exercise
comments, and the Student Manual so they no longer point at a solutions
folder that isn't here.

Co-Authored-By: Claude Sonnet 5.5 <noreply@anthropic.com>
</commit_message>
<xml_diff>
--- a/Student Manual/docx/Introduction-to-C-Programming-Student-Manual.docx
+++ b/Student Manual/docx/Introduction-to-C-Programming-Student-Manual.docx
@@ -381,16 +381,7 @@
         <w:t xml:space="preserve">TODO</w:t>
       </w:r>
       <w:r>
-        <w:t xml:space="preserve"> markers. A </w:t>
-      </w:r>
-      <w:r>
-        <w:rPr>
-          <w:rFonts w:ascii="Courier New" w:cs="Courier New" w:eastAsia="Courier New" w:hAnsi="Courier New"/>
-        </w:rPr>
-        <w:t xml:space="preserve">solutions/</w:t>
-      </w:r>
-      <w:r>
-        <w:t xml:space="preserve"> folder sits next to them — try for at least 15 minutes before you look.</w:t>
+        <w:t xml:space="preserve"> markers. Reference solutions aren't included in this repo — your instructor shares them after the deadline, so give each exercise a real attempt (at least 15 minutes) and use your compiler output and debugging to check your own work.</w:t>
       </w:r>
     </w:p>
     <w:p>
@@ -43549,18 +43540,7 @@
         <w:t xml:space="preserve">exercises/exercise1.c</w:t>
       </w:r>
       <w:r>
-        <w:t xml:space="preserve"> -- find and describe the bug yourself before checking </w:t>
-      </w:r>
-      <w:r>
-        <w:rPr>
-          <w:b/>
-          <w:bCs/>
-          <w:rFonts w:ascii="Courier New" w:cs="Courier New" w:eastAsia="Courier New" w:hAnsi="Courier New"/>
-        </w:rPr>
-        <w:t xml:space="preserve">exercises/solutions/exercise1_solution.c</w:t>
-      </w:r>
-      <w:r>
-        <w:t xml:space="preserve">.</w:t>
+        <w:t xml:space="preserve"> -- find and describe the bug yourself before asking your instructor for the reference solution.</w:t>
       </w:r>
     </w:p>
     <w:p>

</xml_diff>